<commit_message>
Snapshot current NewLoop tree including tests and document reorg
</commit_message>
<xml_diff>
--- a/writings/New Loop Brief.docx
+++ b/writings/New Loop Brief.docx
@@ -91,7 +91,19 @@
         <w:rPr>
           <w:rFonts w:ascii="Cambria" w:hAnsi="Cambria"/>
         </w:rPr>
-        <w:t xml:space="preserve"> each aimed at a distinct failure mode. A Public Trust Fund gradually broadens equity ownership without nationalizing industry. Universal Basic Income restores an income floor as wages become less reliable. A VAT with a low-income rebate captures revenue in an economy where labor income is no longer the main taxable base. A corporate tax that rises automatically as the wage share falls helps rebalance the system as automation advances. Mortgage indexation, paired with government make-whole payments, prevents structural deflation from crushing households with legacy fixed debt while keeping banks whole.</w:t>
+        <w:t xml:space="preserve"> each aimed at a distinct failure mode. A Public Trust Fund gradually broadens equity ownership without nationalizing industry. </w:t>
+      </w:r>
+      <w:r>
+        <w:rPr>
+          <w:rFonts w:ascii="Cambria" w:hAnsi="Cambria"/>
+        </w:rPr>
+        <w:t xml:space="preserve">Income support </w:t>
+      </w:r>
+      <w:r>
+        <w:rPr>
+          <w:rFonts w:ascii="Cambria" w:hAnsi="Cambria"/>
+        </w:rPr>
+        <w:t>restores an income floor as wages become less reliable. A VAT with a low-income rebate captures revenue in an economy where labor income is no longer the main taxable base. A corporate tax that rises automatically as the wage share falls helps rebalance the system as automation advances. Mortgage indexation, paired with government make-whole payments, prevents structural deflation from crushing households with legacy fixed debt while keeping banks whole.</w:t>
       </w:r>
     </w:p>
     <w:p>
@@ -104,7 +116,19 @@
         <w:rPr>
           <w:rFonts w:ascii="Cambria" w:hAnsi="Cambria"/>
         </w:rPr>
-        <w:t>These mechanisms reinforce one another. The Trust Fund helps finance UBI. VAT provides a tax base that does not depend on wage growth. Mortgage indexation blocks a debt-deflation spiral that could otherwise destabilize the entire transition. Together, they form a new loop linking production, income, consumption, and investment.</w:t>
+        <w:t xml:space="preserve">These mechanisms reinforce one another. The Trust Fund helps finance </w:t>
+      </w:r>
+      <w:r>
+        <w:rPr>
+          <w:rFonts w:ascii="Cambria" w:hAnsi="Cambria"/>
+        </w:rPr>
+        <w:t>income support</w:t>
+      </w:r>
+      <w:r>
+        <w:rPr>
+          <w:rFonts w:ascii="Cambria" w:hAnsi="Cambria"/>
+        </w:rPr>
+        <w:t>. VAT provides a tax base that does not depend on wage growth. Mortgage indexation blocks a debt-deflation spiral that could otherwise destabilize the entire transition. Together, they form a new loop linking production, income, consumption, and investment.</w:t>
       </w:r>
     </w:p>
     <w:p>
@@ -117,7 +141,31 @@
         <w:rPr>
           <w:rFonts w:ascii="Cambria" w:hAnsi="Cambria"/>
         </w:rPr>
-        <w:t>The framework is implemented in a public stock-flow consistent computational model. It is fully inspectable, parameterized, and interactive. Users can change assumptions and observe the results over a twenty-year transition. In the model, the full package allows real incomes and consumption to recover after an initial deflationary shock, improves disposable-income inequality substantially, and does so without dramatically confiscating existing wealth</w:t>
+        <w:t>The framework is implemented in a public stock-flow consistent computational model. It is</w:t>
+      </w:r>
+      <w:r>
+        <w:rPr>
+          <w:rFonts w:ascii="Cambria" w:hAnsi="Cambria"/>
+        </w:rPr>
+        <w:t xml:space="preserve"> </w:t>
+      </w:r>
+      <w:r>
+        <w:rPr>
+          <w:rFonts w:ascii="Cambria" w:hAnsi="Cambria"/>
+        </w:rPr>
+        <w:t>parameterized</w:t>
+      </w:r>
+      <w:r>
+        <w:rPr>
+          <w:rFonts w:ascii="Cambria" w:hAnsi="Cambria"/>
+        </w:rPr>
+        <w:t xml:space="preserve"> </w:t>
+      </w:r>
+      <w:r>
+        <w:rPr>
+          <w:rFonts w:ascii="Cambria" w:hAnsi="Cambria"/>
+        </w:rPr>
+        <w:t>and interactive. Users can change assumptions and observe the results over a twenty-year transition. In the model, the full package allows real incomes and consumption to recover after an initial deflationary shock, improves disposable-income inequality substantially, and does so without dramatically confiscating existing wealth</w:t>
       </w:r>
     </w:p>
     <w:p>

</xml_diff>